<commit_message>
B15-L1: correct the note on why sentence-transformers was not run
Co-Authored-By: Claude Opus 5.5 <noreply@anthropic.com>
Claude-Session: https://claude.ai/code/session_01115scNbPGEnHTmmnr4vEBh
</commit_message>
<xml_diff>
--- a/site/downloads/handbook-B15.docx
+++ b/site/downloads/handbook-B15.docx
@@ -462,7 +462,7 @@
           <w:b w:val="0"/>
           <w:i w:val="0"/>
         </w:rPr>
-        <w:t>sentence-transformers needs PyTorch, which this app cannot run in the browser and this course's build could not install. The API details above are taken from the library's documentation and marked as not run here. The exercises use NumPy on vectors.</w:t>
+        <w:t>sentence-transformers needs PyTorch, which this app cannot run in the browser. This course's build did not run sentence-transformers, so the API details above come from the library's documentation and are marked as not run. The exercises use NumPy on vectors.</w:t>
       </w:r>
     </w:p>
     <w:p>
@@ -1702,7 +1702,7 @@
           <w:b w:val="0"/>
           <w:i w:val="0"/>
         </w:rPr>
-        <w:t>SentenceTransformer("sentence-transformers/all-MiniLM-L6-v2").encode(texts, batch_size=..., normalize_embeddings=True) returns 384-dimensional vectors. (unverified: sentence-transformers documentation and model card. Not run: PyTorch could not be installed in this environment.)</w:t>
+        <w:t>SentenceTransformer("sentence-transformers/all-MiniLM-L6-v2").encode(texts, batch_size=..., normalize_embeddings=True) returns 384-dimensional vectors. (unverified: sentence-transformers documentation and model card. Not run in this course's build.)</w:t>
       </w:r>
     </w:p>
     <w:p>

</xml_diff>